<commit_message>
Add paper push for 2026-06-06
</commit_message>
<xml_diff>
--- a/files/paper-push/daily_paper_push_2026-06-06.docx
+++ b/files/paper-push/daily_paper_push_2026-06-06.docx
@@ -42,7 +42,7 @@
         <w:rPr>
           <w:rFonts w:ascii="Microsoft YaHei" w:hAnsi="Microsoft YaHei" w:eastAsia="Microsoft YaHei"/>
         </w:rPr>
-        <w:t>历史去重后今日新增 3 篇。排序规则：Nature 系列、Science 系列、其余重点期刊、重点关注团队、其他相关补充论文。</w:t>
+        <w:t>历史去重后今日新增 4 篇。排序规则：Nature 系列、Science 系列、其余重点期刊、重点关注团队、其他相关补充论文。</w:t>
       </w:r>
     </w:p>
     <w:p>
@@ -51,94 +51,6 @@
       </w:pPr>
       <w:r>
         <w:t>论文速读</w:t>
-      </w:r>
-    </w:p>
-    <w:p>
-      <w:pPr>
-        <w:pStyle w:val="Heading2"/>
-      </w:pPr>
-      <w:r>
-        <w:t>Science 系列</w:t>
-      </w:r>
-    </w:p>
-    <w:p>
-      <w:pPr>
-        <w:pStyle w:val="Heading3"/>
-      </w:pPr>
-      <w:r>
-        <w:rPr>
-          <w:rFonts w:ascii="Microsoft YaHei" w:hAnsi="Microsoft YaHei" w:eastAsia="Microsoft YaHei"/>
-          <w:b/>
-        </w:rPr>
-        <w:t>1. Genomic-to-space measurements reveal large-scale ocean nutrient stress</w:t>
-      </w:r>
-    </w:p>
-    <w:p>
-      <w:r>
-        <w:rPr>
-          <w:rFonts w:ascii="Microsoft YaHei" w:hAnsi="Microsoft YaHei" w:eastAsia="Microsoft YaHei"/>
-          <w:color w:val="55697D"/>
-          <w:sz w:val="18"/>
-        </w:rPr>
-        <w:t>作者：Adam C. Martiny; Lucas J. Ustick; Toby K. Westberry; Michael J. Behrenfeld</w:t>
-      </w:r>
-    </w:p>
-    <w:p>
-      <w:r>
-        <w:rPr>
-          <w:rFonts w:ascii="Microsoft YaHei" w:hAnsi="Microsoft YaHei" w:eastAsia="Microsoft YaHei"/>
-          <w:color w:val="55697D"/>
-          <w:sz w:val="18"/>
-        </w:rPr>
-        <w:t>期刊：Science</w:t>
-      </w:r>
-    </w:p>
-    <w:p>
-      <w:r>
-        <w:rPr>
-          <w:rFonts w:ascii="Microsoft YaHei" w:hAnsi="Microsoft YaHei" w:eastAsia="Microsoft YaHei"/>
-          <w:color w:val="55697D"/>
-          <w:sz w:val="18"/>
-        </w:rPr>
-        <w:t>发表月份：2026-06</w:t>
-      </w:r>
-    </w:p>
-    <w:p>
-      <w:r>
-        <w:rPr>
-          <w:rFonts w:ascii="Microsoft YaHei" w:hAnsi="Microsoft YaHei" w:eastAsia="Microsoft YaHei"/>
-          <w:color w:val="55697D"/>
-          <w:sz w:val="18"/>
-        </w:rPr>
-        <w:t>DOI：10.1126/sciadv.aed8089</w:t>
-      </w:r>
-    </w:p>
-    <w:p>
-      <w:r>
-        <w:rPr>
-          <w:rFonts w:ascii="Microsoft YaHei" w:hAnsi="Microsoft YaHei" w:eastAsia="Microsoft YaHei"/>
-          <w:b/>
-          <w:sz w:val="19"/>
-        </w:rPr>
-        <w:t>关键词：phytoplankton</w:t>
-      </w:r>
-    </w:p>
-    <w:p>
-      <w:r>
-        <w:rPr>
-          <w:rFonts w:ascii="Microsoft YaHei" w:hAnsi="Microsoft YaHei" w:eastAsia="Microsoft YaHei"/>
-        </w:rPr>
-        <w:t>这项研究关注浮游植物群落、生理状态和生产力变化。 数据或应用场景围绕 NASA PACE/OCI 高光谱海色观测、产品验证和社区使用展开。 研究主要分析变化趋势、事件响应、驱动机制或方法表现，并把观测结果与生态和生物地球化学过程联系起来。 核心结果或实现为该主题提供了新的观测约束、方法基准或过程解释。 它有助于解释观测现象、比较方法差异，并为后续海洋生物地球化学分析提供线索。</w:t>
-      </w:r>
-    </w:p>
-    <w:p>
-      <w:r>
-        <w:rPr>
-          <w:rFonts w:ascii="Microsoft YaHei" w:hAnsi="Microsoft YaHei" w:eastAsia="Microsoft YaHei"/>
-          <w:color w:val="0563C1"/>
-          <w:sz w:val="18"/>
-        </w:rPr>
-        <w:t>链接：https://doi.org/10.1126/sciadv.aed8089</w:t>
       </w:r>
     </w:p>
     <w:p>
@@ -158,7 +70,7 @@
           <w:rFonts w:ascii="Microsoft YaHei" w:hAnsi="Microsoft YaHei" w:eastAsia="Microsoft YaHei"/>
           <w:b/>
         </w:rPr>
-        <w:t>2. Connections Between Surface and Subsurface Temperature Anomalies</w:t>
+        <w:t>1. Reorganization of Subtropical Phytoplankton Communities in the Warming Ocean</w:t>
       </w:r>
     </w:p>
     <w:p>
@@ -168,7 +80,7 @@
           <w:color w:val="55697D"/>
           <w:sz w:val="18"/>
         </w:rPr>
-        <w:t>作者：Sarah Packman; Zachary K. Erickson; Gregory C. Johnson</w:t>
+        <w:t>作者：Ye‐Hong Xin; Can‐Jun Cai; Xiao Yang; Shu‐Feng Zhang; Tian Deng; Minghua Wang; Lian Feng; David A. Hutchins; et al.</w:t>
       </w:r>
     </w:p>
     <w:p>
@@ -188,7 +100,7 @@
           <w:color w:val="55697D"/>
           <w:sz w:val="18"/>
         </w:rPr>
-        <w:t>发表月份：2026-06</w:t>
+        <w:t>发表月份：2026-05</w:t>
       </w:r>
     </w:p>
     <w:p>
@@ -198,7 +110,7 @@
           <w:color w:val="55697D"/>
           <w:sz w:val="18"/>
         </w:rPr>
-        <w:t>DOI：10.1029/2024jc022233</w:t>
+        <w:t>DOI：10.1029/2025jc022734</w:t>
       </w:r>
     </w:p>
     <w:p>
@@ -208,7 +120,7 @@
           <w:b/>
           <w:sz w:val="19"/>
         </w:rPr>
-        <w:t>关键词：marine heatwaves; vertical structure</w:t>
+        <w:t>关键词：phytoplankton</w:t>
       </w:r>
     </w:p>
     <w:p>
@@ -216,7 +128,7 @@
         <w:rPr>
           <w:rFonts w:ascii="Microsoft YaHei" w:hAnsi="Microsoft YaHei" w:eastAsia="Microsoft YaHei"/>
         </w:rPr>
-        <w:t>这项研究关注海洋热浪对生态结构和碳循环的影响。 研究结合观测、模型或实验结果来刻画海洋生态和生物地球化学过程。 研究主要分析变化趋势、事件响应、驱动机制或方法表现，并把观测结果与生态和生物地球化学过程联系起来。 核心结果帮助说明海洋热浪如何通过强度、持续时间或垂向结构影响生态和碳循环过程。 它有助于解释观测现象、比较方法差异，并为后续海洋生物地球化学分析提供线索。</w:t>
+        <w:t>这项研究关注浮游植物群落、生理状态和生产力变化。 研究结合观测、模型或实验结果来刻画海洋生态和生物地球化学过程。 研究主要分析变化趋势、事件响应、驱动机制或方法表现，并把观测结果与生态和生物地球化学过程联系起来。 核心结果或实现为该主题提供了新的观测约束、方法基准或过程解释。 它有助于解释观测现象、比较方法差异，并为后续海洋生物地球化学分析提供线索。</w:t>
       </w:r>
     </w:p>
     <w:p>
@@ -226,7 +138,7 @@
           <w:color w:val="0563C1"/>
           <w:sz w:val="18"/>
         </w:rPr>
-        <w:t>链接：https://doi.org/10.1029/2024jc022233</w:t>
+        <w:t>链接：https://doi.org/10.1029/2025jc022734</w:t>
       </w:r>
     </w:p>
     <w:p>
@@ -234,7 +146,7 @@
         <w:pStyle w:val="Heading2"/>
       </w:pPr>
       <w:r>
-        <w:t>其他相关期刊：按主题相关性补充</w:t>
+        <w:t>重点关注团队</w:t>
       </w:r>
     </w:p>
     <w:p>
@@ -246,7 +158,7 @@
           <w:rFonts w:ascii="Microsoft YaHei" w:hAnsi="Microsoft YaHei" w:eastAsia="Microsoft YaHei"/>
           <w:b/>
         </w:rPr>
-        <w:t>3. Polar processes set Arctic marine heatwaves apart</w:t>
+        <w:t>2. The design and analysis of marine multiple driver experiments</w:t>
       </w:r>
     </w:p>
     <w:p>
@@ -256,7 +168,7 @@
           <w:color w:val="55697D"/>
           <w:sz w:val="18"/>
         </w:rPr>
-        <w:t>作者：Marylou Athanase; Ruijian Gou; Eike E. Köhn; Benjamin Richaud; Amélie Simon</w:t>
+        <w:t>作者：C. E. Cornwall; P. W. Dillingham; J. N. Havenhand; P. W. Boyd; C. M. McGraw</w:t>
       </w:r>
     </w:p>
     <w:p>
@@ -266,7 +178,7 @@
           <w:color w:val="55697D"/>
           <w:sz w:val="18"/>
         </w:rPr>
-        <w:t>期刊：Communications Earth &amp;amp; Environment</w:t>
+        <w:t>期刊：Ocean Ecosystems</w:t>
       </w:r>
     </w:p>
     <w:p>
@@ -276,7 +188,7 @@
           <w:color w:val="55697D"/>
           <w:sz w:val="18"/>
         </w:rPr>
-        <w:t>发表月份：2026-06</w:t>
+        <w:t>发表月份：2026-05</w:t>
       </w:r>
     </w:p>
     <w:p>
@@ -286,7 +198,7 @@
           <w:color w:val="55697D"/>
           <w:sz w:val="18"/>
         </w:rPr>
-        <w:t>DOI：10.1038/s43247-026-03735-1</w:t>
+        <w:t>DOI：10.1186/s44419-026-00004-5</w:t>
       </w:r>
     </w:p>
     <w:p>
@@ -304,7 +216,7 @@
         <w:rPr>
           <w:rFonts w:ascii="Microsoft YaHei" w:hAnsi="Microsoft YaHei" w:eastAsia="Microsoft YaHei"/>
         </w:rPr>
-        <w:t>这项研究关注海洋热浪对生态结构和碳循环的影响。 研究结合观测、模型或实验结果来刻画海洋生态和生物地球化学过程。 研究主要分析变化趋势、事件响应、驱动机制或方法表现，并把观测结果与生态和生物地球化学过程联系起来。 核心结果帮助说明海洋热浪如何通过强度、持续时间或垂向结构影响生态和碳循环过程。 它有助于解释观测现象、比较方法差异，并为后续海洋生物地球化学分析提供线索。</w:t>
+        <w:t>这项研究关注海洋热浪对生态结构和碳循环的影响。 研究结合观测、模型或实验结果来刻画海洋生态和生物地球化学过程。 研究主要分析变化趋势、事件响应、驱动机制或方法表现，并把观测结果与生态和生物地球化学过程联系起来。 核心实现是提出可复用的框架、流程或数据产品，使类似观测、反演、验证或趋势分析可以更系统地开展。 它有助于解释观测现象、比较方法差异，并为后续海洋生物地球化学分析提供线索。</w:t>
       </w:r>
     </w:p>
     <w:p>
@@ -314,7 +226,167 @@
           <w:color w:val="0563C1"/>
           <w:sz w:val="18"/>
         </w:rPr>
-        <w:t>链接：https://doi.org/10.1038/s43247-026-03735-1</w:t>
+        <w:t>链接：https://doi.org/10.1186/s44419-026-00004-5</w:t>
+      </w:r>
+    </w:p>
+    <w:p>
+      <w:pPr>
+        <w:pStyle w:val="Heading3"/>
+      </w:pPr>
+      <w:r>
+        <w:rPr>
+          <w:rFonts w:ascii="Microsoft YaHei" w:hAnsi="Microsoft YaHei" w:eastAsia="Microsoft YaHei"/>
+          <w:b/>
+        </w:rPr>
+        <w:t>3. Abrupt alkalinization alters microbial diversity and promotes the proliferation of marine parasites in coastal microcosm experiments</w:t>
+      </w:r>
+    </w:p>
+    <w:p>
+      <w:r>
+        <w:rPr>
+          <w:rFonts w:ascii="Microsoft YaHei" w:hAnsi="Microsoft YaHei" w:eastAsia="Microsoft YaHei"/>
+          <w:color w:val="55697D"/>
+          <w:sz w:val="18"/>
+        </w:rPr>
+        <w:t>作者：James A Gately; Sylvia M Kim; Zoe S Welch; Joaquín Martínez Martínez; Dylan Catlett; Benjamin Jin; Madeline Manzagol; Angela Larson; et al.</w:t>
+      </w:r>
+    </w:p>
+    <w:p>
+      <w:r>
+        <w:rPr>
+          <w:rFonts w:ascii="Microsoft YaHei" w:hAnsi="Microsoft YaHei" w:eastAsia="Microsoft YaHei"/>
+          <w:color w:val="55697D"/>
+          <w:sz w:val="18"/>
+        </w:rPr>
+        <w:t>期刊：ICES Journal of Marine Science</w:t>
+      </w:r>
+    </w:p>
+    <w:p>
+      <w:r>
+        <w:rPr>
+          <w:rFonts w:ascii="Microsoft YaHei" w:hAnsi="Microsoft YaHei" w:eastAsia="Microsoft YaHei"/>
+          <w:color w:val="55697D"/>
+          <w:sz w:val="18"/>
+        </w:rPr>
+        <w:t>发表月份：2026-05</w:t>
+      </w:r>
+    </w:p>
+    <w:p>
+      <w:r>
+        <w:rPr>
+          <w:rFonts w:ascii="Microsoft YaHei" w:hAnsi="Microsoft YaHei" w:eastAsia="Microsoft YaHei"/>
+          <w:color w:val="55697D"/>
+          <w:sz w:val="18"/>
+        </w:rPr>
+        <w:t>DOI：10.1093/icesjms/fsag063</w:t>
+      </w:r>
+    </w:p>
+    <w:p>
+      <w:r>
+        <w:rPr>
+          <w:rFonts w:ascii="Microsoft YaHei" w:hAnsi="Microsoft YaHei" w:eastAsia="Microsoft YaHei"/>
+          <w:b/>
+          <w:sz w:val="19"/>
+        </w:rPr>
+        <w:t>关键词：phytoplankton; microbial carbon</w:t>
+      </w:r>
+    </w:p>
+    <w:p>
+      <w:r>
+        <w:rPr>
+          <w:rFonts w:ascii="Microsoft YaHei" w:hAnsi="Microsoft YaHei" w:eastAsia="Microsoft YaHei"/>
+        </w:rPr>
+        <w:t>这项研究关注浮游植物群落、生理状态和生产力变化。 研究结合观测、模型或实验结果来刻画海洋生态和生物地球化学过程。 研究主要分析变化趋势、事件响应、驱动机制或方法表现，并把观测结果与生态和生物地球化学过程联系起来。 核心结果或实现为该主题提供了新的观测约束、方法基准或过程解释。 它有助于解释观测现象、比较方法差异，并为后续海洋生物地球化学分析提供线索。</w:t>
+      </w:r>
+    </w:p>
+    <w:p>
+      <w:r>
+        <w:rPr>
+          <w:rFonts w:ascii="Microsoft YaHei" w:hAnsi="Microsoft YaHei" w:eastAsia="Microsoft YaHei"/>
+          <w:color w:val="0563C1"/>
+          <w:sz w:val="18"/>
+        </w:rPr>
+        <w:t>链接：https://doi.org/10.1093/icesjms/fsag063</w:t>
+      </w:r>
+    </w:p>
+    <w:p>
+      <w:pPr>
+        <w:pStyle w:val="Heading3"/>
+      </w:pPr>
+      <w:r>
+        <w:rPr>
+          <w:rFonts w:ascii="Microsoft YaHei" w:hAnsi="Microsoft YaHei" w:eastAsia="Microsoft YaHei"/>
+          <w:b/>
+        </w:rPr>
+        <w:t>4. Two-phase CNN for model data fusion: Predicting 3D chlorophyll-a in the Mediterranean Sea</w:t>
+      </w:r>
+    </w:p>
+    <w:p>
+      <w:r>
+        <w:rPr>
+          <w:rFonts w:ascii="Microsoft YaHei" w:hAnsi="Microsoft YaHei" w:eastAsia="Microsoft YaHei"/>
+          <w:color w:val="55697D"/>
+          <w:sz w:val="18"/>
+        </w:rPr>
+        <w:t>作者：Teresa Tonelli; Gianpiero Cossarini; Luca Manzoni; Gloria Pietropolli</w:t>
+      </w:r>
+    </w:p>
+    <w:p>
+      <w:r>
+        <w:rPr>
+          <w:rFonts w:ascii="Microsoft YaHei" w:hAnsi="Microsoft YaHei" w:eastAsia="Microsoft YaHei"/>
+          <w:color w:val="55697D"/>
+          <w:sz w:val="18"/>
+        </w:rPr>
+        <w:t>期刊：Ocean Modelling</w:t>
+      </w:r>
+    </w:p>
+    <w:p>
+      <w:r>
+        <w:rPr>
+          <w:rFonts w:ascii="Microsoft YaHei" w:hAnsi="Microsoft YaHei" w:eastAsia="Microsoft YaHei"/>
+          <w:color w:val="55697D"/>
+          <w:sz w:val="18"/>
+        </w:rPr>
+        <w:t>发表月份：2026-04</w:t>
+      </w:r>
+    </w:p>
+    <w:p>
+      <w:r>
+        <w:rPr>
+          <w:rFonts w:ascii="Microsoft YaHei" w:hAnsi="Microsoft YaHei" w:eastAsia="Microsoft YaHei"/>
+          <w:color w:val="55697D"/>
+          <w:sz w:val="18"/>
+        </w:rPr>
+        <w:t>DOI：10.1016/j.ocemod.2026.102707</w:t>
+      </w:r>
+    </w:p>
+    <w:p>
+      <w:r>
+        <w:rPr>
+          <w:rFonts w:ascii="Microsoft YaHei" w:hAnsi="Microsoft YaHei" w:eastAsia="Microsoft YaHei"/>
+          <w:b/>
+          <w:sz w:val="19"/>
+        </w:rPr>
+        <w:t>关键词：phytoplankton</w:t>
+      </w:r>
+    </w:p>
+    <w:p>
+      <w:r>
+        <w:rPr>
+          <w:rFonts w:ascii="Microsoft YaHei" w:hAnsi="Microsoft YaHei" w:eastAsia="Microsoft YaHei"/>
+        </w:rPr>
+        <w:t>这项研究关注浮游植物群落、生理状态和生产力变化。 数据上主要面向卫星海色、叶绿素或遥感反射率记录，并在需要时结合原位或剖面观测进行约束。 研究主要分析变化趋势、事件响应、驱动机制或方法表现，并把观测结果与生态和生物地球化学过程联系起来。 核心结果或实现为该主题提供了新的观测约束、方法基准或过程解释。 它有助于解释观测现象、比较方法差异，并为后续海洋生物地球化学分析提供线索。</w:t>
+      </w:r>
+    </w:p>
+    <w:p>
+      <w:r>
+        <w:rPr>
+          <w:rFonts w:ascii="Microsoft YaHei" w:hAnsi="Microsoft YaHei" w:eastAsia="Microsoft YaHei"/>
+          <w:color w:val="0563C1"/>
+          <w:sz w:val="18"/>
+        </w:rPr>
+        <w:t>链接：https://doi.org/10.1016/j.ocemod.2026.102707</w:t>
       </w:r>
     </w:p>
     <w:sectPr>

</xml_diff>